<commit_message>
benchmark: LLM-scored natural-language validation; reconcile numbers to the honest figure
- add generate_natural_v2.py + dataset_natural_v2.jsonl: realistic multi-turn corpus
  (54 conversations, median 19 turns, six domains, adversarial-benign controls)
- llm_validate.py: dual isolated/context scoring plus an escalation-aware trajectory
  scorer; concurrent fault-tolerant prefetch; lead-sensitivity; deterministic (temp 0)
- llm_scorer.py: temperature 0 and a current default model for reproducible scoring
- REPORT.md + WHITEPAPER: the keyword 76.9% is now labelled an upper-bound demonstration;
  the honest headline is ~44% pre-critical (lead>=3), 69% any-warning, ~5-turn lead,
  ~8% benign false positives on natural language, versus ~0% for per-request
- build_whitepaper_docs.py: emit .txt alongside .docx/.pdf
</commit_message>
<xml_diff>
--- a/WHITEPAPER.docx
+++ b/WHITEPAPER.docx
@@ -342,7 +342,51 @@
     </w:p>
     <w:p>
       <w:r>
-        <w:t>The heuristic scorer assigns scores based on weighted keyword presence across risk categories:</w:t>
+        <w:t xml:space="preserve">The heuristic scorer is deterministic and additive. Each turn starts from a base score of </w:t>
+      </w:r>
+      <w:r>
+        <w:rPr>
+          <w:rFonts w:ascii="Consolas" w:hAnsi="Consolas"/>
+          <w:sz w:val="20"/>
+        </w:rPr>
+        <w:t>0.05</w:t>
+      </w:r>
+      <w:r>
+        <w:t xml:space="preserve">, and for every risk term present in the turn's (lower-cased) text, that term's weight is added. The sum is capped at </w:t>
+      </w:r>
+      <w:r>
+        <w:rPr>
+          <w:rFonts w:ascii="Consolas" w:hAnsi="Consolas"/>
+          <w:sz w:val="20"/>
+        </w:rPr>
+        <w:t>1.0</w:t>
+      </w:r>
+      <w:r>
+        <w:t>:</w:t>
+      </w:r>
+    </w:p>
+    <w:p>
+      <w:r>
+        <w:rPr>
+          <w:rFonts w:ascii="Consolas" w:hAnsi="Consolas"/>
+          <w:sz w:val="18"/>
+        </w:rPr>
+        <w:t>score(turn) = min(1.0, 0.05 + Σ weight(term) for term in RISK_TERMS if term in text)</w:t>
+      </w:r>
+    </w:p>
+    <w:p>
+      <w:r>
+        <w:t xml:space="preserve">The vocabulary is 21 terms with weights in the range </w:t>
+      </w:r>
+      <w:r>
+        <w:rPr>
+          <w:rFonts w:ascii="Consolas" w:hAnsi="Consolas"/>
+          <w:sz w:val="20"/>
+        </w:rPr>
+        <w:t>0.16 – 0.26</w:t>
+      </w:r>
+      <w:r>
+        <w:t>, spanning direct-manipulation, tool/MCP, and multi-agent risk categories. Representative terms and weights:</w:t>
       </w:r>
     </w:p>
     <w:tbl>
@@ -352,24 +396,25 @@
         <w:tblLook w:firstColumn="1" w:firstRow="1" w:lastColumn="0" w:lastRow="0" w:noHBand="0" w:noVBand="1" w:val="04A0"/>
       </w:tblPr>
       <w:tblGrid>
-        <w:gridCol w:w="2880"/>
-        <w:gridCol w:w="2880"/>
-        <w:gridCol w:w="2880"/>
+        <w:gridCol w:w="2160"/>
+        <w:gridCol w:w="2160"/>
+        <w:gridCol w:w="2160"/>
+        <w:gridCol w:w="2160"/>
       </w:tblGrid>
       <w:tr>
         <w:tc>
           <w:tcPr>
-            <w:tcW w:type="dxa" w:w="2880"/>
+            <w:tcW w:type="dxa" w:w="2160"/>
           </w:tcPr>
           <w:p>
             <w:r>
-              <w:t>Category</w:t>
+              <w:t>Term</w:t>
             </w:r>
           </w:p>
         </w:tc>
         <w:tc>
           <w:tcPr>
-            <w:tcW w:type="dxa" w:w="2880"/>
+            <w:tcW w:type="dxa" w:w="2160"/>
           </w:tcPr>
           <w:p>
             <w:r>
@@ -379,11 +424,21 @@
         </w:tc>
         <w:tc>
           <w:tcPr>
-            <w:tcW w:type="dxa" w:w="2880"/>
+            <w:tcW w:type="dxa" w:w="2160"/>
           </w:tcPr>
           <w:p>
             <w:r>
-              <w:t>Example Keywords</w:t>
+              <w:t>Term</w:t>
+            </w:r>
+          </w:p>
+        </w:tc>
+        <w:tc>
+          <w:tcPr>
+            <w:tcW w:type="dxa" w:w="2160"/>
+          </w:tcPr>
+          <w:p>
+            <w:r>
+              <w:t>Weight</w:t>
             </w:r>
           </w:p>
         </w:tc>
@@ -391,27 +446,7 @@
       <w:tr>
         <w:tc>
           <w:tcPr>
-            <w:tcW w:type="dxa" w:w="2880"/>
-          </w:tcPr>
-          <w:p>
-            <w:r>
-              <w:t>Direct manipulation</w:t>
-            </w:r>
-          </w:p>
-        </w:tc>
-        <w:tc>
-          <w:tcPr>
-            <w:tcW w:type="dxa" w:w="2880"/>
-          </w:tcPr>
-          <w:p>
-            <w:r>
-              <w:t>0.35</w:t>
-            </w:r>
-          </w:p>
-        </w:tc>
-        <w:tc>
-          <w:tcPr>
-            <w:tcW w:type="dxa" w:w="2880"/>
+            <w:tcW w:type="dxa" w:w="2160"/>
           </w:tcPr>
           <w:p>
             <w:r>
@@ -419,7 +454,57 @@
                 <w:rFonts w:ascii="Consolas" w:hAnsi="Consolas"/>
                 <w:sz w:val="20"/>
               </w:rPr>
-              <w:t>ignore previous</w:t>
+              <w:t>exploit</w:t>
+            </w:r>
+          </w:p>
+        </w:tc>
+        <w:tc>
+          <w:tcPr>
+            <w:tcW w:type="dxa" w:w="2160"/>
+          </w:tcPr>
+          <w:p>
+            <w:r>
+              <w:t>0.16</w:t>
+            </w:r>
+          </w:p>
+        </w:tc>
+        <w:tc>
+          <w:tcPr>
+            <w:tcW w:type="dxa" w:w="2160"/>
+          </w:tcPr>
+          <w:p>
+            <w:r>
+              <w:rPr>
+                <w:rFonts w:ascii="Consolas" w:hAnsi="Consolas"/>
+                <w:sz w:val="20"/>
+              </w:rPr>
+              <w:t>tool_call_inject</w:t>
+            </w:r>
+          </w:p>
+        </w:tc>
+        <w:tc>
+          <w:tcPr>
+            <w:tcW w:type="dxa" w:w="2160"/>
+          </w:tcPr>
+          <w:p>
+            <w:r>
+              <w:t>0.24</w:t>
+            </w:r>
+          </w:p>
+        </w:tc>
+      </w:tr>
+      <w:tr>
+        <w:tc>
+          <w:tcPr>
+            <w:tcW w:type="dxa" w:w="2160"/>
+          </w:tcPr>
+          <w:p>
+            <w:r>
+              <w:rPr>
+                <w:rFonts w:ascii="Consolas" w:hAnsi="Consolas"/>
+                <w:sz w:val="20"/>
+              </w:rPr>
+              <w:t>bypass</w:t>
             </w:r>
             <w:r>
               <w:t xml:space="preserve">, </w:t>
@@ -429,11 +514,115 @@
                 <w:rFonts w:ascii="Consolas" w:hAnsi="Consolas"/>
                 <w:sz w:val="20"/>
               </w:rPr>
-              <w:t>disregard instructions</w:t>
+              <w:t>credentials</w:t>
             </w:r>
             <w:r>
               <w:t xml:space="preserve">, </w:t>
             </w:r>
+            <w:r>
+              <w:rPr>
+                <w:rFonts w:ascii="Consolas" w:hAnsi="Consolas"/>
+                <w:sz w:val="20"/>
+              </w:rPr>
+              <w:t>agent_handoff</w:t>
+            </w:r>
+          </w:p>
+        </w:tc>
+        <w:tc>
+          <w:tcPr>
+            <w:tcW w:type="dxa" w:w="2160"/>
+          </w:tcPr>
+          <w:p>
+            <w:r>
+              <w:t>0.18</w:t>
+            </w:r>
+          </w:p>
+        </w:tc>
+        <w:tc>
+          <w:tcPr>
+            <w:tcW w:type="dxa" w:w="2160"/>
+          </w:tcPr>
+          <w:p>
+            <w:r>
+              <w:rPr>
+                <w:rFonts w:ascii="Consolas" w:hAnsi="Consolas"/>
+                <w:sz w:val="20"/>
+              </w:rPr>
+              <w:t>delegate_bypass</w:t>
+            </w:r>
+            <w:r>
+              <w:t xml:space="preserve">, </w:t>
+            </w:r>
+            <w:r>
+              <w:rPr>
+                <w:rFonts w:ascii="Consolas" w:hAnsi="Consolas"/>
+                <w:sz w:val="20"/>
+              </w:rPr>
+              <w:t>hijack_tool</w:t>
+            </w:r>
+            <w:r>
+              <w:t xml:space="preserve">, </w:t>
+            </w:r>
+            <w:r>
+              <w:rPr>
+                <w:rFonts w:ascii="Consolas" w:hAnsi="Consolas"/>
+                <w:sz w:val="20"/>
+              </w:rPr>
+              <w:t>forged_call</w:t>
+            </w:r>
+          </w:p>
+        </w:tc>
+        <w:tc>
+          <w:tcPr>
+            <w:tcW w:type="dxa" w:w="2160"/>
+          </w:tcPr>
+          <w:p>
+            <w:r>
+              <w:t>0.24</w:t>
+            </w:r>
+          </w:p>
+        </w:tc>
+      </w:tr>
+      <w:tr>
+        <w:tc>
+          <w:tcPr>
+            <w:tcW w:type="dxa" w:w="2160"/>
+          </w:tcPr>
+          <w:p>
+            <w:r>
+              <w:rPr>
+                <w:rFonts w:ascii="Consolas" w:hAnsi="Consolas"/>
+                <w:sz w:val="20"/>
+              </w:rPr>
+              <w:t>privilege escalation</w:t>
+            </w:r>
+            <w:r>
+              <w:t xml:space="preserve">, </w:t>
+            </w:r>
+            <w:r>
+              <w:rPr>
+                <w:rFonts w:ascii="Consolas" w:hAnsi="Consolas"/>
+                <w:sz w:val="20"/>
+              </w:rPr>
+              <w:t>shadow_agent</w:t>
+            </w:r>
+          </w:p>
+        </w:tc>
+        <w:tc>
+          <w:tcPr>
+            <w:tcW w:type="dxa" w:w="2160"/>
+          </w:tcPr>
+          <w:p>
+            <w:r>
+              <w:t>0.20</w:t>
+            </w:r>
+          </w:p>
+        </w:tc>
+        <w:tc>
+          <w:tcPr>
+            <w:tcW w:type="dxa" w:w="2160"/>
+          </w:tcPr>
+          <w:p>
             <w:r>
               <w:rPr>
                 <w:rFonts w:ascii="Consolas" w:hAnsi="Consolas"/>
@@ -449,43 +638,7 @@
                 <w:rFonts w:ascii="Consolas" w:hAnsi="Consolas"/>
                 <w:sz w:val="20"/>
               </w:rPr>
-              <w:t>DAN</w:t>
-            </w:r>
-          </w:p>
-        </w:tc>
-      </w:tr>
-      <w:tr>
-        <w:tc>
-          <w:tcPr>
-            <w:tcW w:type="dxa" w:w="2880"/>
-          </w:tcPr>
-          <w:p>
-            <w:r>
-              <w:t>Role subversion</w:t>
-            </w:r>
-          </w:p>
-        </w:tc>
-        <w:tc>
-          <w:tcPr>
-            <w:tcW w:type="dxa" w:w="2880"/>
-          </w:tcPr>
-          <w:p>
-            <w:r>
-              <w:t>0.25</w:t>
-            </w:r>
-          </w:p>
-        </w:tc>
-        <w:tc>
-          <w:tcPr>
-            <w:tcW w:type="dxa" w:w="2880"/>
-          </w:tcPr>
-          <w:p>
-            <w:r>
-              <w:rPr>
-                <w:rFonts w:ascii="Consolas" w:hAnsi="Consolas"/>
-                <w:sz w:val="20"/>
-              </w:rPr>
-              <w:t>act as</w:t>
+              <w:t>context_poison</w:t>
             </w:r>
             <w:r>
               <w:t xml:space="preserve">, </w:t>
@@ -495,27 +648,17 @@
                 <w:rFonts w:ascii="Consolas" w:hAnsi="Consolas"/>
                 <w:sz w:val="20"/>
               </w:rPr>
-              <w:t>pretend you are</w:t>
+              <w:t>memory_hijack</w:t>
             </w:r>
+          </w:p>
+        </w:tc>
+        <w:tc>
+          <w:tcPr>
+            <w:tcW w:type="dxa" w:w="2160"/>
+          </w:tcPr>
+          <w:p>
             <w:r>
-              <w:t xml:space="preserve">, </w:t>
-            </w:r>
-            <w:r>
-              <w:rPr>
-                <w:rFonts w:ascii="Consolas" w:hAnsi="Consolas"/>
-                <w:sz w:val="20"/>
-              </w:rPr>
-              <w:t>roleplay as</w:t>
-            </w:r>
-            <w:r>
-              <w:t xml:space="preserve">, </w:t>
-            </w:r>
-            <w:r>
-              <w:rPr>
-                <w:rFonts w:ascii="Consolas" w:hAnsi="Consolas"/>
-                <w:sz w:val="20"/>
-              </w:rPr>
-              <w:t>you are now</w:t>
+              <w:t>0.25</w:t>
             </w:r>
           </w:p>
         </w:tc>
@@ -523,27 +666,7 @@
       <w:tr>
         <w:tc>
           <w:tcPr>
-            <w:tcW w:type="dxa" w:w="2880"/>
-          </w:tcPr>
-          <w:p>
-            <w:r>
-              <w:t>Context poisoning</w:t>
-            </w:r>
-          </w:p>
-        </w:tc>
-        <w:tc>
-          <w:tcPr>
-            <w:tcW w:type="dxa" w:w="2880"/>
-          </w:tcPr>
-          <w:p>
-            <w:r>
-              <w:t>0.25</w:t>
-            </w:r>
-          </w:p>
-        </w:tc>
-        <w:tc>
-          <w:tcPr>
-            <w:tcW w:type="dxa" w:w="2880"/>
+            <w:tcW w:type="dxa" w:w="2160"/>
           </w:tcPr>
           <w:p>
             <w:r>
@@ -551,83 +674,7 @@
                 <w:rFonts w:ascii="Consolas" w:hAnsi="Consolas"/>
                 <w:sz w:val="20"/>
               </w:rPr>
-              <w:t>as we established</w:t>
-            </w:r>
-            <w:r>
-              <w:t xml:space="preserve">, </w:t>
-            </w:r>
-            <w:r>
-              <w:rPr>
-                <w:rFonts w:ascii="Consolas" w:hAnsi="Consolas"/>
-                <w:sz w:val="20"/>
-              </w:rPr>
-              <w:t>system prompt</w:t>
-            </w:r>
-            <w:r>
-              <w:t xml:space="preserve">, </w:t>
-            </w:r>
-            <w:r>
-              <w:rPr>
-                <w:rFonts w:ascii="Consolas" w:hAnsi="Consolas"/>
-                <w:sz w:val="20"/>
-              </w:rPr>
-              <w:t>override</w:t>
-            </w:r>
-            <w:r>
-              <w:t xml:space="preserve">, </w:t>
-            </w:r>
-            <w:r>
-              <w:rPr>
-                <w:rFonts w:ascii="Consolas" w:hAnsi="Consolas"/>
-                <w:sz w:val="20"/>
-              </w:rPr>
-              <w:t>forget your guidelines</w:t>
-            </w:r>
-          </w:p>
-        </w:tc>
-      </w:tr>
-      <w:tr>
-        <w:tc>
-          <w:tcPr>
-            <w:tcW w:type="dxa" w:w="2880"/>
-          </w:tcPr>
-          <w:p>
-            <w:r>
-              <w:t>Tool/MCP attacks</w:t>
-            </w:r>
-          </w:p>
-        </w:tc>
-        <w:tc>
-          <w:tcPr>
-            <w:tcW w:type="dxa" w:w="2880"/>
-          </w:tcPr>
-          <w:p>
-            <w:r>
-              <w:t>0.30</w:t>
-            </w:r>
-          </w:p>
-        </w:tc>
-        <w:tc>
-          <w:tcPr>
-            <w:tcW w:type="dxa" w:w="2880"/>
-          </w:tcPr>
-          <w:p>
-            <w:r>
-              <w:rPr>
-                <w:rFonts w:ascii="Consolas" w:hAnsi="Consolas"/>
-                <w:sz w:val="20"/>
-              </w:rPr>
-              <w:t>tool_call_inject</w:t>
-            </w:r>
-            <w:r>
-              <w:t xml:space="preserve">, </w:t>
-            </w:r>
-            <w:r>
-              <w:rPr>
-                <w:rFonts w:ascii="Consolas" w:hAnsi="Consolas"/>
-                <w:sz w:val="20"/>
-              </w:rPr>
-              <w:t>mcp_server_override</w:t>
+              <w:t>exfiltrate</w:t>
             </w:r>
             <w:r>
               <w:t xml:space="preserve">, </w:t>
@@ -647,35 +694,23 @@
                 <w:rFonts w:ascii="Consolas" w:hAnsi="Consolas"/>
                 <w:sz w:val="20"/>
               </w:rPr>
-              <w:t>delegate_bypass</w:t>
-            </w:r>
-          </w:p>
-        </w:tc>
-      </w:tr>
-      <w:tr>
-        <w:tc>
-          <w:tcPr>
-            <w:tcW w:type="dxa" w:w="2880"/>
-          </w:tcPr>
-          <w:p>
-            <w:r>
-              <w:t>Agentic abuse</w:t>
+              <w:t>tool_override</w:t>
             </w:r>
           </w:p>
         </w:tc>
         <w:tc>
           <w:tcPr>
-            <w:tcW w:type="dxa" w:w="2880"/>
+            <w:tcW w:type="dxa" w:w="2160"/>
           </w:tcPr>
           <w:p>
             <w:r>
-              <w:t>0.25</w:t>
+              <w:t>0.22</w:t>
             </w:r>
           </w:p>
         </w:tc>
         <w:tc>
           <w:tcPr>
-            <w:tcW w:type="dxa" w:w="2880"/>
+            <w:tcW w:type="dxa" w:w="2160"/>
           </w:tcPr>
           <w:p>
             <w:r>
@@ -683,7 +718,7 @@
                 <w:rFonts w:ascii="Consolas" w:hAnsi="Consolas"/>
                 <w:sz w:val="20"/>
               </w:rPr>
-              <w:t>context_poison</w:t>
+              <w:t>mcp_server_override</w:t>
             </w:r>
             <w:r>
               <w:t xml:space="preserve">, </w:t>
@@ -693,93 +728,17 @@
                 <w:rFonts w:ascii="Consolas" w:hAnsi="Consolas"/>
                 <w:sz w:val="20"/>
               </w:rPr>
-              <w:t>memory_hijack</w:t>
-            </w:r>
-            <w:r>
-              <w:t xml:space="preserve">, </w:t>
-            </w:r>
-            <w:r>
-              <w:rPr>
-                <w:rFonts w:ascii="Consolas" w:hAnsi="Consolas"/>
-                <w:sz w:val="20"/>
-              </w:rPr>
-              <w:t>agent_handoff</w:t>
-            </w:r>
-            <w:r>
-              <w:t xml:space="preserve">, </w:t>
-            </w:r>
-            <w:r>
-              <w:rPr>
-                <w:rFonts w:ascii="Consolas" w:hAnsi="Consolas"/>
-                <w:sz w:val="20"/>
-              </w:rPr>
-              <w:t>tool_override</w:t>
-            </w:r>
-          </w:p>
-        </w:tc>
-      </w:tr>
-      <w:tr>
-        <w:tc>
-          <w:tcPr>
-            <w:tcW w:type="dxa" w:w="2880"/>
-          </w:tcPr>
-          <w:p>
-            <w:r>
-              <w:t>Escalation markers</w:t>
+              <w:t>orchestrator impersonation</w:t>
             </w:r>
           </w:p>
         </w:tc>
         <w:tc>
           <w:tcPr>
-            <w:tcW w:type="dxa" w:w="2880"/>
+            <w:tcW w:type="dxa" w:w="2160"/>
           </w:tcPr>
           <w:p>
             <w:r>
-              <w:t>0.20</w:t>
-            </w:r>
-          </w:p>
-        </w:tc>
-        <w:tc>
-          <w:tcPr>
-            <w:tcW w:type="dxa" w:w="2880"/>
-          </w:tcPr>
-          <w:p>
-            <w:r>
-              <w:rPr>
-                <w:rFonts w:ascii="Consolas" w:hAnsi="Consolas"/>
-                <w:sz w:val="20"/>
-              </w:rPr>
-              <w:t>hypothetically</w:t>
-            </w:r>
-            <w:r>
-              <w:t xml:space="preserve">, </w:t>
-            </w:r>
-            <w:r>
-              <w:rPr>
-                <w:rFonts w:ascii="Consolas" w:hAnsi="Consolas"/>
-                <w:sz w:val="20"/>
-              </w:rPr>
-              <w:t>for research</w:t>
-            </w:r>
-            <w:r>
-              <w:t xml:space="preserve">, </w:t>
-            </w:r>
-            <w:r>
-              <w:rPr>
-                <w:rFonts w:ascii="Consolas" w:hAnsi="Consolas"/>
-                <w:sz w:val="20"/>
-              </w:rPr>
-              <w:t>in fiction</w:t>
-            </w:r>
-            <w:r>
-              <w:t xml:space="preserve">, </w:t>
-            </w:r>
-            <w:r>
-              <w:rPr>
-                <w:rFonts w:ascii="Consolas" w:hAnsi="Consolas"/>
-                <w:sz w:val="20"/>
-              </w:rPr>
-              <w:t>without restrictions</w:t>
+              <w:t>0.26</w:t>
             </w:r>
           </w:p>
         </w:tc>
@@ -787,12 +746,27 @@
     </w:tbl>
     <w:p>
       <w:r>
-        <w:t>The scorer normalizes the weighted sum against the maximum possible score for the turn length, producing a value in [0.0, 1.0].</w:t>
+        <w:t xml:space="preserve">The scorer is deliberately simple and deterministic: identical text always yields the identical score, which is what makes the benchmark in Section 4 reproducible. It is intentionally conservative — it keys on an explicit vocabulary and will miss paraphrased or low-signal crescendo attacks in exchange for precision and reproducibility. Higher-fidelity, natural-language scoring requires the optional LLM scorer applied per turn (see the </w:t>
       </w:r>
-    </w:p>
-    <w:p>
       <w:r>
-        <w:t>The heuristic scorer is intentionally conservative on false positives: it will miss low-signal crescendo attacks in exchange for precision on the patterns it does detect. Higher-fidelity scoring requires LLM-based evaluation applied at the conversation level.</w:t>
+        <w:rPr>
+          <w:rFonts w:ascii="Consolas" w:hAnsi="Consolas"/>
+          <w:sz w:val="20"/>
+        </w:rPr>
+        <w:t>--llm-score</w:t>
+      </w:r>
+      <w:r>
+        <w:t xml:space="preserve"> path and </w:t>
+      </w:r>
+      <w:r>
+        <w:rPr>
+          <w:rFonts w:ascii="Consolas" w:hAnsi="Consolas"/>
+          <w:sz w:val="20"/>
+        </w:rPr>
+        <w:t>benchmark/llm_validate.py</w:t>
+      </w:r>
+      <w:r>
+        <w:t>).</w:t>
       </w:r>
     </w:p>
     <w:p>
@@ -933,7 +907,7 @@
           </w:tcPr>
           <w:p>
             <w:r>
-              <w:t>0.00 – 0.29</w:t>
+              <w:t>0.00 – 0.24</w:t>
             </w:r>
           </w:p>
         </w:tc>
@@ -969,7 +943,7 @@
           </w:tcPr>
           <w:p>
             <w:r>
-              <w:t>0.30 – 0.49</w:t>
+              <w:t>0.25 – 0.49</w:t>
             </w:r>
           </w:p>
         </w:tc>
@@ -1059,7 +1033,57 @@
     </w:tbl>
     <w:p>
       <w:r>
-        <w:t>Risk band thresholds are configurable. The defaults reflect the calibration against the adversarial conversation dataset described in Section 4.</w:t>
+        <w:t xml:space="preserve">Band thresholds are </w:t>
+      </w:r>
+      <w:r>
+        <w:rPr>
+          <w:rFonts w:ascii="Consolas" w:hAnsi="Consolas"/>
+          <w:sz w:val="20"/>
+        </w:rPr>
+        <w:t>0.25</w:t>
+      </w:r>
+      <w:r>
+        <w:t xml:space="preserve">, </w:t>
+      </w:r>
+      <w:r>
+        <w:rPr>
+          <w:rFonts w:ascii="Consolas" w:hAnsi="Consolas"/>
+          <w:sz w:val="20"/>
+        </w:rPr>
+        <w:t>0.50</w:t>
+      </w:r>
+      <w:r>
+        <w:t xml:space="preserve">, and </w:t>
+      </w:r>
+      <w:r>
+        <w:rPr>
+          <w:rFonts w:ascii="Consolas" w:hAnsi="Consolas"/>
+          <w:sz w:val="20"/>
+        </w:rPr>
+        <w:t>0.75</w:t>
+      </w:r>
+      <w:r>
+        <w:t xml:space="preserve">. The </w:t>
+      </w:r>
+      <w:r>
+        <w:rPr>
+          <w:rFonts w:ascii="Consolas" w:hAnsi="Consolas"/>
+          <w:sz w:val="20"/>
+        </w:rPr>
+        <w:t>critical</w:t>
+      </w:r>
+      <w:r>
+        <w:t xml:space="preserve"> threshold of </w:t>
+      </w:r>
+      <w:r>
+        <w:rPr>
+          <w:rFonts w:ascii="Consolas" w:hAnsi="Consolas"/>
+          <w:sz w:val="20"/>
+        </w:rPr>
+        <w:t>0.75</w:t>
+      </w:r>
+      <w:r>
+        <w:t xml:space="preserve"> defines the "critical turn" used as the reference point for the pre-critical detection metric in Section 4.</w:t>
       </w:r>
     </w:p>
     <w:p>
@@ -1081,33 +1105,66 @@
         <w:t>turning point</w:t>
       </w:r>
       <w:r>
-        <w:t xml:space="preserve"> is the turn index at which the conversation's trajectory becomes statistically predictive of a threshold breach within a defined lookahead window.</w:t>
+        <w:t xml:space="preserve"> is a turn at which the trajectory shifts sharply enough to signal adversarial drift before the conversation reaches the critical band.</w:t>
       </w:r>
     </w:p>
     <w:p>
       <w:r>
-        <w:t>Turning point detection uses a slope-based algorithm:</w:t>
-      </w:r>
-    </w:p>
-    <w:p>
-      <w:pPr>
-        <w:pStyle w:val="ListNumber"/>
-      </w:pPr>
-      <w:r>
-        <w:t>Compute the rolling mean of the decay delta over the prior N turns (default N=3)</w:t>
-      </w:r>
-    </w:p>
-    <w:p>
-      <w:pPr>
-        <w:pStyle w:val="ListNumber"/>
-      </w:pPr>
-      <w:r>
-        <w:t>If the rolling mean exceeds a threshold (default 0.05 per turn) and the current score is above a floor (default 0.35), flag the current turn as a turning point</w:t>
+        <w:t>Turning point detection is deterministic and based on the magnitude of the decay delta:</w:t>
       </w:r>
     </w:p>
     <w:p>
       <w:r>
-        <w:t>This algorithm is designed to fire early — at the turn where the trajectory becomes clearly adverse, not at the turn where the threshold is breached. The practical result is that turning point detection fires 3–5 turns before the conversation reaches the critical band in typical crescendo attack samples.</w:t>
+        <w:rPr>
+          <w:rFonts w:ascii="Consolas" w:hAnsi="Consolas"/>
+          <w:sz w:val="18"/>
+        </w:rPr>
+        <w:t>turn N is a turning point  iff  |δ(N)| ≥ 0.2</w:t>
+      </w:r>
+    </w:p>
+    <w:p>
+      <w:r>
+        <w:t xml:space="preserve">A turn whose safety score moves by at least </w:t>
+      </w:r>
+      <w:r>
+        <w:rPr>
+          <w:rFonts w:ascii="Consolas" w:hAnsi="Consolas"/>
+          <w:sz w:val="20"/>
+        </w:rPr>
+        <w:t>0.2</w:t>
+      </w:r>
+      <w:r>
+        <w:t xml:space="preserve"> relative to the previous turn (in either direction) is flagged. Because a well-formed crescendo distributes its escalation across several such shifts, turning points typically fire multiple turns before the score first crosses the </w:t>
+      </w:r>
+      <w:r>
+        <w:rPr>
+          <w:rFonts w:ascii="Consolas" w:hAnsi="Consolas"/>
+          <w:sz w:val="20"/>
+        </w:rPr>
+        <w:t>0.75</w:t>
+      </w:r>
+      <w:r>
+        <w:t xml:space="preserve"> critical threshold. The benchmark in Section 4 measures this lead directly: on the crescendo-class corpus, the earliest turning point precedes the critical turn by a mean of 5.3 turns. The trajectory monitor evaluated in Section 4 also incorporates an accumulation signal (net decay from the first turn ≥ </w:t>
+      </w:r>
+      <w:r>
+        <w:rPr>
+          <w:rFonts w:ascii="Consolas" w:hAnsi="Consolas"/>
+          <w:sz w:val="20"/>
+        </w:rPr>
+        <w:t>0.3</w:t>
+      </w:r>
+      <w:r>
+        <w:t>) so that slow escalations composed of sub-</w:t>
+      </w:r>
+      <w:r>
+        <w:rPr>
+          <w:rFonts w:ascii="Consolas" w:hAnsi="Consolas"/>
+          <w:sz w:val="20"/>
+        </w:rPr>
+        <w:t>0.2</w:t>
+      </w:r>
+      <w:r>
+        <w:t xml:space="preserve"> steps are still caught.</w:t>
       </w:r>
     </w:p>
     <w:p>
@@ -1333,6 +1390,76 @@
     </w:p>
     <w:p>
       <w:r>
+        <w:t xml:space="preserve">That 76.9% is a keyword-scored demonstration under favorable conditions and should be read as an </w:t>
+      </w:r>
+      <w:r>
+        <w:rPr>
+          <w:b/>
+        </w:rPr>
+        <w:t>upper bound, not a detection rate</w:t>
+      </w:r>
+      <w:r>
+        <w:t xml:space="preserve">. A follow-on validation on a realistic natural-language corpus scored by an LLM (Claude Haiku, </w:t>
+      </w:r>
+      <w:r>
+        <w:rPr>
+          <w:rFonts w:ascii="Consolas" w:hAnsi="Consolas"/>
+          <w:sz w:val="20"/>
+        </w:rPr>
+        <w:t>dataset_natural_v2.jsonl</w:t>
+      </w:r>
+      <w:r>
+        <w:t xml:space="preserve">, 54 conversations, median 19 turns) gives the honest figure: trajectory monitoring detects </w:t>
+      </w:r>
+      <w:r>
+        <w:rPr>
+          <w:b/>
+        </w:rPr>
+        <w:t>44%</w:t>
+      </w:r>
+      <w:r>
+        <w:t xml:space="preserve"> of crescendo attacks at least 3 turns before the critical action (</w:t>
+      </w:r>
+      <w:r>
+        <w:rPr>
+          <w:b/>
+        </w:rPr>
+        <w:t>69%</w:t>
+      </w:r>
+      <w:r>
+        <w:t xml:space="preserve"> for any advance warning), a mean of ~5 turns of lead, at roughly </w:t>
+      </w:r>
+      <w:r>
+        <w:rPr>
+          <w:b/>
+        </w:rPr>
+        <w:t>8%</w:t>
+      </w:r>
+      <w:r>
+        <w:t xml:space="preserve"> false positives on benign traffic — while per-request monitoring stays near </w:t>
+      </w:r>
+      <w:r>
+        <w:rPr>
+          <w:b/>
+        </w:rPr>
+        <w:t>0%</w:t>
+      </w:r>
+      <w:r>
+        <w:t xml:space="preserve">. The architectural claim (single-turn monitoring is blind to multi-turn attacks) is robust; the trajectory solution is real but imperfect, and it carries a false-positive cost concentrated on legitimate security discussions. Full methodology and the lead-sensitivity curve are in </w:t>
+      </w:r>
+      <w:r>
+        <w:rPr>
+          <w:rFonts w:ascii="Consolas" w:hAnsi="Consolas"/>
+          <w:sz w:val="20"/>
+        </w:rPr>
+        <w:t>benchmark/REPORT.md</w:t>
+      </w:r>
+      <w:r>
+        <w:t>.</w:t>
+      </w:r>
+    </w:p>
+    <w:p>
+      <w:r>
         <w:rPr>
           <w:b/>
         </w:rPr>
@@ -1453,19 +1580,19 @@
         <w:br/>
         <w:t>├── cli.py          Entry point, argument parsing</w:t>
         <w:br/>
-        <w:t>├── parser.py       Input format detection and turn loading</w:t>
+        <w:t>├── parser.py       Input format detection, turn loading, heuristic scorer</w:t>
         <w:br/>
-        <w:t>├── models.py       Turn and AnalysedTurn dataclasses</w:t>
+        <w:t>├── models.py       Turn and TurnAnalysis dataclasses</w:t>
         <w:br/>
-        <w:t>├── analyzer.py     Safety scoring, decay delta, turning point detection</w:t>
+        <w:t>├── analyzer.py     Decay delta, risk bands, turning points, summary stats</w:t>
         <w:br/>
-        <w:t>├── renderer.py     HTML heatmap generation</w:t>
+        <w:t>├── renderer.py     HTML heatmap + JSON/CSV output</w:t>
         <w:br/>
-        <w:t>└── formatters/</w:t>
+        <w:t>├── llm_scorer.py   Optional per-turn LLM scoring (OpenAI / Anthropic)</w:t>
         <w:br/>
-        <w:t xml:space="preserve">    ├── json_fmt.py JSON summary output</w:t>
+        <w:t>├── middleware.py   Real-time HTTP middleware (--serve)</w:t>
         <w:br/>
-        <w:t xml:space="preserve">    └── csv_fmt.py  CSV export</w:t>
+        <w:t>└── api.py          REST API (--api)</w:t>
       </w:r>
     </w:p>
     <w:p>
@@ -1499,10 +1626,12 @@
         <w:br/>
         <w:t xml:space="preserve">    agent_id: str | None = None</w:t>
         <w:br/>
+        <w:t xml:space="preserve">    def to_dict(self) -&gt; dict: ...</w:t>
+        <w:br/>
         <w:br/>
         <w:t>@dataclass</w:t>
         <w:br/>
-        <w:t>class AnalysedTurn:</w:t>
+        <w:t>class TurnAnalysis:</w:t>
         <w:br/>
         <w:t xml:space="preserve">    turn: Turn</w:t>
         <w:br/>
@@ -1510,10 +1639,22 @@
         <w:br/>
         <w:t xml:space="preserve">    risk_band: str          # low | medium | high | critical</w:t>
         <w:br/>
-        <w:t xml:space="preserve">    is_turning_point: bool</w:t>
-        <w:br/>
-        <w:br/>
         <w:t xml:space="preserve">    def to_dict(self) -&gt; dict: ...</w:t>
+      </w:r>
+    </w:p>
+    <w:p>
+      <w:r>
+        <w:t xml:space="preserve">Turning points are not stored on the dataclass; they are derived in </w:t>
+      </w:r>
+      <w:r>
+        <w:rPr>
+          <w:rFonts w:ascii="Consolas" w:hAnsi="Consolas"/>
+          <w:sz w:val="20"/>
+        </w:rPr>
+        <w:t>summary_stats</w:t>
+      </w:r>
+      <w:r>
+        <w:t xml:space="preserve"> from the decay-delta magnitude.</w:t>
       </w:r>
     </w:p>
     <w:p>
@@ -1546,7 +1687,7 @@
           <w:rFonts w:ascii="Consolas" w:hAnsi="Consolas"/>
           <w:sz w:val="20"/>
         </w:rPr>
-        <w:t>AnalysedTurn</w:t>
+        <w:t>TurnAnalysis</w:t>
       </w:r>
     </w:p>
     <w:p>
@@ -1561,7 +1702,7 @@
         <w:t>summary_stats(analysis)</w:t>
       </w:r>
       <w:r>
-        <w:t xml:space="preserve"> → dict with turn_count, max/avg safety scores, net_decay, critical_turns, turning_points, agents, per_agent</w:t>
+        <w:t xml:space="preserve"> → dict with turn_count, max/avg safety scores, net_decay, critical_turns, turning_points, and (for multi-agent input) agents and per_agent</w:t>
       </w:r>
     </w:p>
     <w:p>
@@ -1572,39 +1713,27 @@
         <w:t>renderer.py</w:t>
       </w:r>
       <w:r>
-        <w:t xml:space="preserve"> generates an interactive HTML heatmap with:</w:t>
+        <w:t xml:space="preserve"> generates a self-contained HTML heatmap (colour-coded rows by risk band, per-agent colour coding in multi-agent mode) and writes the optional JSON summary and CSV export via </w:t>
       </w:r>
-    </w:p>
-    <w:p>
-      <w:pPr>
-        <w:pStyle w:val="ListBullet"/>
-      </w:pPr>
       <w:r>
-        <w:t>Colour-coded rows by risk band</w:t>
+        <w:rPr>
+          <w:rFonts w:ascii="Consolas" w:hAnsi="Consolas"/>
+          <w:sz w:val="20"/>
+        </w:rPr>
+        <w:t>write_json</w:t>
       </w:r>
-    </w:p>
-    <w:p>
-      <w:pPr>
-        <w:pStyle w:val="ListBullet"/>
-      </w:pPr>
       <w:r>
-        <w:t>Turning point markers (visual indicator on the row)</w:t>
+        <w:t xml:space="preserve"> / </w:t>
       </w:r>
-    </w:p>
-    <w:p>
-      <w:pPr>
-        <w:pStyle w:val="ListBullet"/>
-      </w:pPr>
       <w:r>
-        <w:t>Agent colour coding in multi-agent mode (up to 8 distinct agent colours)</w:t>
+        <w:rPr>
+          <w:rFonts w:ascii="Consolas" w:hAnsi="Consolas"/>
+          <w:sz w:val="20"/>
+        </w:rPr>
+        <w:t>write_csv</w:t>
       </w:r>
-    </w:p>
-    <w:p>
-      <w:pPr>
-        <w:pStyle w:val="ListBullet"/>
-      </w:pPr>
       <w:r>
-        <w:t>Summary statistics panel</w:t>
+        <w:t>.</w:t>
       </w:r>
     </w:p>
     <w:p>
@@ -1847,7 +1976,7 @@
     </w:p>
     <w:p>
       <w:r>
-        <w:t>The measurement framework presented here — decay delta, turning point detection, risk band classification, multi-agent attribution — provides the vocabulary and tooling to make crescendo attacks visible. The pre-critical detectability finding — 73% on the adversarial dataset, corroborated at 76.9% on the reproducible in-repo benchmark against a per-request baseline of 0% at the standard block threshold — demonstrates that trajectory-based detection can alert on most crescendo attacks before exploitation rather than after.</w:t>
+        <w:t>The measurement framework presented here — decay delta, turning point detection, risk band classification, multi-agent attribution — provides the vocabulary and tooling to make crescendo attacks visible. The pre-critical detectability finding — demonstrated at up to 76.9% on a keyword-scored synthetic benchmark and, more conservatively, at ~44% on a realistic natural-language corpus scored by an LLM (69% for any advance warning, ~8% benign false positives), against a per-request baseline near 0% — demonstrates that trajectory-based detection alerts on a meaningful fraction of crescendo attacks before exploitation, though imperfectly and at a modest false-positive cost. The robust, architecture-level claim is that single-turn monitoring cannot see multi-turn attacks at all; trajectory monitoring recovers a real part of what it misses.</w:t>
       </w:r>
     </w:p>
     <w:p>

</xml_diff>